<commit_message>
Add DOCX volumes; update registries & metrics
Adds multiple DOCX volumes and pattern documents: AU Volume 01 & 02 under Human-Frictions/AU (Authentication & Forms), PAT-056 (Volume 04), and PAT-053–PAT-058 (Volume 05 - Trust, Privacy & Digital Identity). Also updates several registry and metrics documents (Pattern Volume Registry.docx.docx, APID-Registry.docx, Category-Registry.docx, Pattern-Registry.docx, Human Friction Metrics.docx, Pattern Metrics.docx). All changes are binary DOCX additions/updates.

Co-Authored-By: Project UIL <309146262+researchprojectuil-prog@users.noreply.github.com>
Co-Authored-By: jothish-blip <215570346+jothish-blip@users.noreply.github.com>
</commit_message>
<xml_diff>
--- a/atlas/Patterns/Pattern Volume Registry.docx.docx
+++ b/atlas/Patterns/Pattern Volume Registry.docx.docx
@@ -2034,13 +2034,8 @@
           </w:tcPr>
           <w:p>
             <w:r>
-              <w:t xml:space="preserve">Adaptive System </w:t>
-            </w:r>
-            <w:proofErr w:type="spellStart"/>
-            <w:r>
-              <w:t>Behavior</w:t>
-            </w:r>
-            <w:proofErr w:type="spellEnd"/>
+              <w:t>Adaptive System Behavior</w:t>
+            </w:r>
           </w:p>
         </w:tc>
         <w:tc>
@@ -2120,15 +2115,7 @@
           </w:tcPr>
           <w:p>
             <w:r>
-              <w:t>Human-</w:t>
-            </w:r>
-            <w:proofErr w:type="spellStart"/>
-            <w:r>
-              <w:t>Centered</w:t>
-            </w:r>
-            <w:proofErr w:type="spellEnd"/>
-            <w:r>
-              <w:t xml:space="preserve"> Computing</w:t>
+              <w:t>Human-Centered Computing</w:t>
             </w:r>
           </w:p>
         </w:tc>
@@ -4424,6 +4411,545 @@
           <w:p>
             <w:r>
               <w:t>Volume 03 – System Behaviour &amp; Interaction</w:t>
+            </w:r>
+          </w:p>
+        </w:tc>
+      </w:tr>
+      <w:tr>
+        <w:trPr>
+          <w:tblCellSpacing w:w="15" w:type="dxa"/>
+        </w:trPr>
+        <w:tc>
+          <w:tcPr>
+            <w:tcW w:w="0" w:type="auto"/>
+            <w:tcBorders>
+              <w:top w:val="single" w:sz="6" w:space="0" w:color="C4C7C5"/>
+              <w:left w:val="single" w:sz="6" w:space="0" w:color="C4C7C5"/>
+              <w:bottom w:val="single" w:sz="6" w:space="0" w:color="C4C7C5"/>
+              <w:right w:val="single" w:sz="6" w:space="0" w:color="C4C7C5"/>
+            </w:tcBorders>
+            <w:tcMar>
+              <w:top w:w="120" w:type="dxa"/>
+              <w:left w:w="180" w:type="dxa"/>
+              <w:bottom w:w="120" w:type="dxa"/>
+              <w:right w:w="180" w:type="dxa"/>
+            </w:tcMar>
+            <w:vAlign w:val="center"/>
+          </w:tcPr>
+          <w:p>
+            <w:pPr>
+              <w:rPr>
+                <w:b/>
+                <w:bCs/>
+              </w:rPr>
+            </w:pPr>
+            <w:r>
+              <w:rPr>
+                <w:b/>
+                <w:bCs/>
+              </w:rPr>
+              <w:t>PAT-053</w:t>
+            </w:r>
+          </w:p>
+        </w:tc>
+        <w:tc>
+          <w:tcPr>
+            <w:tcW w:w="0" w:type="auto"/>
+            <w:tcBorders>
+              <w:top w:val="single" w:sz="6" w:space="0" w:color="C4C7C5"/>
+              <w:left w:val="single" w:sz="6" w:space="0" w:color="C4C7C5"/>
+              <w:bottom w:val="single" w:sz="6" w:space="0" w:color="C4C7C5"/>
+              <w:right w:val="single" w:sz="6" w:space="0" w:color="C4C7C5"/>
+            </w:tcBorders>
+            <w:tcMar>
+              <w:top w:w="120" w:type="dxa"/>
+              <w:left w:w="180" w:type="dxa"/>
+              <w:bottom w:w="120" w:type="dxa"/>
+              <w:right w:w="180" w:type="dxa"/>
+            </w:tcMar>
+            <w:vAlign w:val="center"/>
+          </w:tcPr>
+          <w:p>
+            <w:r>
+              <w:t xml:space="preserve"> Authentication Burden</w:t>
+            </w:r>
+          </w:p>
+        </w:tc>
+        <w:tc>
+          <w:tcPr>
+            <w:tcW w:w="0" w:type="auto"/>
+            <w:tcBorders>
+              <w:top w:val="single" w:sz="6" w:space="0" w:color="C4C7C5"/>
+              <w:left w:val="single" w:sz="6" w:space="0" w:color="C4C7C5"/>
+              <w:bottom w:val="single" w:sz="6" w:space="0" w:color="C4C7C5"/>
+              <w:right w:val="single" w:sz="6" w:space="0" w:color="C4C7C5"/>
+            </w:tcBorders>
+            <w:tcMar>
+              <w:top w:w="120" w:type="dxa"/>
+              <w:left w:w="180" w:type="dxa"/>
+              <w:bottom w:w="120" w:type="dxa"/>
+              <w:right w:w="180" w:type="dxa"/>
+            </w:tcMar>
+            <w:vAlign w:val="center"/>
+          </w:tcPr>
+          <w:p>
+            <w:r>
+              <w:t>Volume 05 – Trust, Privacy &amp; Digital Identity</w:t>
+            </w:r>
+          </w:p>
+        </w:tc>
+      </w:tr>
+      <w:tr>
+        <w:trPr>
+          <w:tblCellSpacing w:w="15" w:type="dxa"/>
+        </w:trPr>
+        <w:tc>
+          <w:tcPr>
+            <w:tcW w:w="0" w:type="auto"/>
+            <w:tcBorders>
+              <w:top w:val="single" w:sz="6" w:space="0" w:color="C4C7C5"/>
+              <w:left w:val="single" w:sz="6" w:space="0" w:color="C4C7C5"/>
+              <w:bottom w:val="single" w:sz="6" w:space="0" w:color="C4C7C5"/>
+              <w:right w:val="single" w:sz="6" w:space="0" w:color="C4C7C5"/>
+            </w:tcBorders>
+            <w:tcMar>
+              <w:top w:w="120" w:type="dxa"/>
+              <w:left w:w="180" w:type="dxa"/>
+              <w:bottom w:w="120" w:type="dxa"/>
+              <w:right w:w="180" w:type="dxa"/>
+            </w:tcMar>
+            <w:vAlign w:val="center"/>
+          </w:tcPr>
+          <w:p>
+            <w:pPr>
+              <w:rPr>
+                <w:b/>
+                <w:bCs/>
+              </w:rPr>
+            </w:pPr>
+            <w:r>
+              <w:rPr>
+                <w:b/>
+                <w:bCs/>
+              </w:rPr>
+              <w:t>PAT-05</w:t>
+            </w:r>
+            <w:r>
+              <w:rPr>
+                <w:b/>
+                <w:bCs/>
+              </w:rPr>
+              <w:t>4</w:t>
+            </w:r>
+          </w:p>
+        </w:tc>
+        <w:tc>
+          <w:tcPr>
+            <w:tcW w:w="0" w:type="auto"/>
+            <w:tcBorders>
+              <w:top w:val="single" w:sz="6" w:space="0" w:color="C4C7C5"/>
+              <w:left w:val="single" w:sz="6" w:space="0" w:color="C4C7C5"/>
+              <w:bottom w:val="single" w:sz="6" w:space="0" w:color="C4C7C5"/>
+              <w:right w:val="single" w:sz="6" w:space="0" w:color="C4C7C5"/>
+            </w:tcBorders>
+            <w:tcMar>
+              <w:top w:w="120" w:type="dxa"/>
+              <w:left w:w="180" w:type="dxa"/>
+              <w:bottom w:w="120" w:type="dxa"/>
+              <w:right w:w="180" w:type="dxa"/>
+            </w:tcMar>
+            <w:vAlign w:val="center"/>
+          </w:tcPr>
+          <w:p>
+            <w:r>
+              <w:t xml:space="preserve"> Credential Lifecycle Management</w:t>
+            </w:r>
+          </w:p>
+        </w:tc>
+        <w:tc>
+          <w:tcPr>
+            <w:tcW w:w="0" w:type="auto"/>
+            <w:tcBorders>
+              <w:top w:val="single" w:sz="6" w:space="0" w:color="C4C7C5"/>
+              <w:left w:val="single" w:sz="6" w:space="0" w:color="C4C7C5"/>
+              <w:bottom w:val="single" w:sz="6" w:space="0" w:color="C4C7C5"/>
+              <w:right w:val="single" w:sz="6" w:space="0" w:color="C4C7C5"/>
+            </w:tcBorders>
+            <w:tcMar>
+              <w:top w:w="120" w:type="dxa"/>
+              <w:left w:w="180" w:type="dxa"/>
+              <w:bottom w:w="120" w:type="dxa"/>
+              <w:right w:w="180" w:type="dxa"/>
+            </w:tcMar>
+            <w:vAlign w:val="center"/>
+          </w:tcPr>
+          <w:p>
+            <w:r>
+              <w:t>Volume 05 – Trust, Privacy &amp; Digital Identity</w:t>
+            </w:r>
+          </w:p>
+        </w:tc>
+      </w:tr>
+      <w:tr>
+        <w:trPr>
+          <w:tblCellSpacing w:w="15" w:type="dxa"/>
+        </w:trPr>
+        <w:tc>
+          <w:tcPr>
+            <w:tcW w:w="0" w:type="auto"/>
+            <w:tcBorders>
+              <w:top w:val="single" w:sz="6" w:space="0" w:color="C4C7C5"/>
+              <w:left w:val="single" w:sz="6" w:space="0" w:color="C4C7C5"/>
+              <w:bottom w:val="single" w:sz="6" w:space="0" w:color="C4C7C5"/>
+              <w:right w:val="single" w:sz="6" w:space="0" w:color="C4C7C5"/>
+            </w:tcBorders>
+            <w:tcMar>
+              <w:top w:w="120" w:type="dxa"/>
+              <w:left w:w="180" w:type="dxa"/>
+              <w:bottom w:w="120" w:type="dxa"/>
+              <w:right w:w="180" w:type="dxa"/>
+            </w:tcMar>
+            <w:vAlign w:val="center"/>
+          </w:tcPr>
+          <w:p>
+            <w:pPr>
+              <w:rPr>
+                <w:b/>
+                <w:bCs/>
+              </w:rPr>
+            </w:pPr>
+            <w:r>
+              <w:rPr>
+                <w:b/>
+                <w:bCs/>
+              </w:rPr>
+              <w:t>PAT-05</w:t>
+            </w:r>
+            <w:r>
+              <w:rPr>
+                <w:b/>
+                <w:bCs/>
+              </w:rPr>
+              <w:t>5</w:t>
+            </w:r>
+          </w:p>
+        </w:tc>
+        <w:tc>
+          <w:tcPr>
+            <w:tcW w:w="0" w:type="auto"/>
+            <w:tcBorders>
+              <w:top w:val="single" w:sz="6" w:space="0" w:color="C4C7C5"/>
+              <w:left w:val="single" w:sz="6" w:space="0" w:color="C4C7C5"/>
+              <w:bottom w:val="single" w:sz="6" w:space="0" w:color="C4C7C5"/>
+              <w:right w:val="single" w:sz="6" w:space="0" w:color="C4C7C5"/>
+            </w:tcBorders>
+            <w:tcMar>
+              <w:top w:w="120" w:type="dxa"/>
+              <w:left w:w="180" w:type="dxa"/>
+              <w:bottom w:w="120" w:type="dxa"/>
+              <w:right w:w="180" w:type="dxa"/>
+            </w:tcMar>
+            <w:vAlign w:val="center"/>
+          </w:tcPr>
+          <w:p>
+            <w:r>
+              <w:t>Identity Verification Behaviour</w:t>
+            </w:r>
+          </w:p>
+        </w:tc>
+        <w:tc>
+          <w:tcPr>
+            <w:tcW w:w="0" w:type="auto"/>
+            <w:tcBorders>
+              <w:top w:val="single" w:sz="6" w:space="0" w:color="C4C7C5"/>
+              <w:left w:val="single" w:sz="6" w:space="0" w:color="C4C7C5"/>
+              <w:bottom w:val="single" w:sz="6" w:space="0" w:color="C4C7C5"/>
+              <w:right w:val="single" w:sz="6" w:space="0" w:color="C4C7C5"/>
+            </w:tcBorders>
+            <w:tcMar>
+              <w:top w:w="120" w:type="dxa"/>
+              <w:left w:w="180" w:type="dxa"/>
+              <w:bottom w:w="120" w:type="dxa"/>
+              <w:right w:w="180" w:type="dxa"/>
+            </w:tcMar>
+            <w:vAlign w:val="center"/>
+          </w:tcPr>
+          <w:p>
+            <w:r>
+              <w:t>Volume 05 – Trust, Privacy &amp; Digital Identity</w:t>
+            </w:r>
+          </w:p>
+        </w:tc>
+      </w:tr>
+      <w:tr>
+        <w:trPr>
+          <w:tblCellSpacing w:w="15" w:type="dxa"/>
+        </w:trPr>
+        <w:tc>
+          <w:tcPr>
+            <w:tcW w:w="0" w:type="auto"/>
+            <w:tcBorders>
+              <w:top w:val="single" w:sz="6" w:space="0" w:color="C4C7C5"/>
+              <w:left w:val="single" w:sz="6" w:space="0" w:color="C4C7C5"/>
+              <w:bottom w:val="single" w:sz="6" w:space="0" w:color="C4C7C5"/>
+              <w:right w:val="single" w:sz="6" w:space="0" w:color="C4C7C5"/>
+            </w:tcBorders>
+            <w:tcMar>
+              <w:top w:w="120" w:type="dxa"/>
+              <w:left w:w="180" w:type="dxa"/>
+              <w:bottom w:w="120" w:type="dxa"/>
+              <w:right w:w="180" w:type="dxa"/>
+            </w:tcMar>
+            <w:vAlign w:val="center"/>
+          </w:tcPr>
+          <w:p>
+            <w:pPr>
+              <w:rPr>
+                <w:b/>
+                <w:bCs/>
+              </w:rPr>
+            </w:pPr>
+            <w:r>
+              <w:rPr>
+                <w:b/>
+                <w:bCs/>
+              </w:rPr>
+              <w:t>PAT-05</w:t>
+            </w:r>
+            <w:r>
+              <w:rPr>
+                <w:b/>
+                <w:bCs/>
+              </w:rPr>
+              <w:t>6</w:t>
+            </w:r>
+          </w:p>
+        </w:tc>
+        <w:tc>
+          <w:tcPr>
+            <w:tcW w:w="0" w:type="auto"/>
+            <w:tcBorders>
+              <w:top w:val="single" w:sz="6" w:space="0" w:color="C4C7C5"/>
+              <w:left w:val="single" w:sz="6" w:space="0" w:color="C4C7C5"/>
+              <w:bottom w:val="single" w:sz="6" w:space="0" w:color="C4C7C5"/>
+              <w:right w:val="single" w:sz="6" w:space="0" w:color="C4C7C5"/>
+            </w:tcBorders>
+            <w:tcMar>
+              <w:top w:w="120" w:type="dxa"/>
+              <w:left w:w="180" w:type="dxa"/>
+              <w:bottom w:w="120" w:type="dxa"/>
+              <w:right w:w="180" w:type="dxa"/>
+            </w:tcMar>
+            <w:vAlign w:val="center"/>
+          </w:tcPr>
+          <w:p>
+            <w:r>
+              <w:t>Form Interaction Behaviour</w:t>
+            </w:r>
+          </w:p>
+        </w:tc>
+        <w:tc>
+          <w:tcPr>
+            <w:tcW w:w="0" w:type="auto"/>
+            <w:tcBorders>
+              <w:top w:val="single" w:sz="6" w:space="0" w:color="C4C7C5"/>
+              <w:left w:val="single" w:sz="6" w:space="0" w:color="C4C7C5"/>
+              <w:bottom w:val="single" w:sz="6" w:space="0" w:color="C4C7C5"/>
+              <w:right w:val="single" w:sz="6" w:space="0" w:color="C4C7C5"/>
+            </w:tcBorders>
+            <w:tcMar>
+              <w:top w:w="120" w:type="dxa"/>
+              <w:left w:w="180" w:type="dxa"/>
+              <w:bottom w:w="120" w:type="dxa"/>
+              <w:right w:w="180" w:type="dxa"/>
+            </w:tcMar>
+            <w:vAlign w:val="center"/>
+          </w:tcPr>
+          <w:p>
+            <w:r>
+              <w:t>Volume 04 – Interface &amp; Navigation Behaviour</w:t>
+            </w:r>
+          </w:p>
+        </w:tc>
+      </w:tr>
+      <w:tr>
+        <w:trPr>
+          <w:tblCellSpacing w:w="15" w:type="dxa"/>
+        </w:trPr>
+        <w:tc>
+          <w:tcPr>
+            <w:tcW w:w="0" w:type="auto"/>
+            <w:tcBorders>
+              <w:top w:val="single" w:sz="6" w:space="0" w:color="C4C7C5"/>
+              <w:left w:val="single" w:sz="6" w:space="0" w:color="C4C7C5"/>
+              <w:bottom w:val="single" w:sz="6" w:space="0" w:color="C4C7C5"/>
+              <w:right w:val="single" w:sz="6" w:space="0" w:color="C4C7C5"/>
+            </w:tcBorders>
+            <w:tcMar>
+              <w:top w:w="120" w:type="dxa"/>
+              <w:left w:w="180" w:type="dxa"/>
+              <w:bottom w:w="120" w:type="dxa"/>
+              <w:right w:w="180" w:type="dxa"/>
+            </w:tcMar>
+            <w:vAlign w:val="center"/>
+          </w:tcPr>
+          <w:p>
+            <w:pPr>
+              <w:rPr>
+                <w:b/>
+                <w:bCs/>
+              </w:rPr>
+            </w:pPr>
+            <w:r>
+              <w:rPr>
+                <w:b/>
+                <w:bCs/>
+              </w:rPr>
+              <w:t>PAT-05</w:t>
+            </w:r>
+            <w:r>
+              <w:rPr>
+                <w:b/>
+                <w:bCs/>
+              </w:rPr>
+              <w:t>7</w:t>
+            </w:r>
+          </w:p>
+        </w:tc>
+        <w:tc>
+          <w:tcPr>
+            <w:tcW w:w="0" w:type="auto"/>
+            <w:tcBorders>
+              <w:top w:val="single" w:sz="6" w:space="0" w:color="C4C7C5"/>
+              <w:left w:val="single" w:sz="6" w:space="0" w:color="C4C7C5"/>
+              <w:bottom w:val="single" w:sz="6" w:space="0" w:color="C4C7C5"/>
+              <w:right w:val="single" w:sz="6" w:space="0" w:color="C4C7C5"/>
+            </w:tcBorders>
+            <w:tcMar>
+              <w:top w:w="120" w:type="dxa"/>
+              <w:left w:w="180" w:type="dxa"/>
+              <w:bottom w:w="120" w:type="dxa"/>
+              <w:right w:w="180" w:type="dxa"/>
+            </w:tcMar>
+            <w:vAlign w:val="center"/>
+          </w:tcPr>
+          <w:p>
+            <w:r>
+              <w:t>Identity Consistency</w:t>
+            </w:r>
+          </w:p>
+        </w:tc>
+        <w:tc>
+          <w:tcPr>
+            <w:tcW w:w="0" w:type="auto"/>
+            <w:tcBorders>
+              <w:top w:val="single" w:sz="6" w:space="0" w:color="C4C7C5"/>
+              <w:left w:val="single" w:sz="6" w:space="0" w:color="C4C7C5"/>
+              <w:bottom w:val="single" w:sz="6" w:space="0" w:color="C4C7C5"/>
+              <w:right w:val="single" w:sz="6" w:space="0" w:color="C4C7C5"/>
+            </w:tcBorders>
+            <w:tcMar>
+              <w:top w:w="120" w:type="dxa"/>
+              <w:left w:w="180" w:type="dxa"/>
+              <w:bottom w:w="120" w:type="dxa"/>
+              <w:right w:w="180" w:type="dxa"/>
+            </w:tcMar>
+            <w:vAlign w:val="center"/>
+          </w:tcPr>
+          <w:p>
+            <w:r>
+              <w:t>Volume 05 – Trust, Privacy &amp; Digital Identity</w:t>
+            </w:r>
+          </w:p>
+        </w:tc>
+      </w:tr>
+      <w:tr>
+        <w:trPr>
+          <w:tblCellSpacing w:w="15" w:type="dxa"/>
+        </w:trPr>
+        <w:tc>
+          <w:tcPr>
+            <w:tcW w:w="0" w:type="auto"/>
+            <w:tcBorders>
+              <w:top w:val="single" w:sz="6" w:space="0" w:color="C4C7C5"/>
+              <w:left w:val="single" w:sz="6" w:space="0" w:color="C4C7C5"/>
+              <w:bottom w:val="single" w:sz="6" w:space="0" w:color="C4C7C5"/>
+              <w:right w:val="single" w:sz="6" w:space="0" w:color="C4C7C5"/>
+            </w:tcBorders>
+            <w:tcMar>
+              <w:top w:w="120" w:type="dxa"/>
+              <w:left w:w="180" w:type="dxa"/>
+              <w:bottom w:w="120" w:type="dxa"/>
+              <w:right w:w="180" w:type="dxa"/>
+            </w:tcMar>
+            <w:vAlign w:val="center"/>
+          </w:tcPr>
+          <w:p>
+            <w:pPr>
+              <w:rPr>
+                <w:b/>
+                <w:bCs/>
+              </w:rPr>
+            </w:pPr>
+            <w:r>
+              <w:rPr>
+                <w:b/>
+                <w:bCs/>
+              </w:rPr>
+              <w:t>PAT-05</w:t>
+            </w:r>
+            <w:r>
+              <w:rPr>
+                <w:b/>
+                <w:bCs/>
+              </w:rPr>
+              <w:t>8</w:t>
+            </w:r>
+          </w:p>
+        </w:tc>
+        <w:tc>
+          <w:tcPr>
+            <w:tcW w:w="0" w:type="auto"/>
+            <w:tcBorders>
+              <w:top w:val="single" w:sz="6" w:space="0" w:color="C4C7C5"/>
+              <w:left w:val="single" w:sz="6" w:space="0" w:color="C4C7C5"/>
+              <w:bottom w:val="single" w:sz="6" w:space="0" w:color="C4C7C5"/>
+              <w:right w:val="single" w:sz="6" w:space="0" w:color="C4C7C5"/>
+            </w:tcBorders>
+            <w:tcMar>
+              <w:top w:w="120" w:type="dxa"/>
+              <w:left w:w="180" w:type="dxa"/>
+              <w:bottom w:w="120" w:type="dxa"/>
+              <w:right w:w="180" w:type="dxa"/>
+            </w:tcMar>
+            <w:vAlign w:val="center"/>
+          </w:tcPr>
+          <w:p>
+            <w:r>
+              <w:t xml:space="preserve"> Authentication Decision Behaviour</w:t>
+            </w:r>
+          </w:p>
+        </w:tc>
+        <w:tc>
+          <w:tcPr>
+            <w:tcW w:w="0" w:type="auto"/>
+            <w:tcBorders>
+              <w:top w:val="single" w:sz="6" w:space="0" w:color="C4C7C5"/>
+              <w:left w:val="single" w:sz="6" w:space="0" w:color="C4C7C5"/>
+              <w:bottom w:val="single" w:sz="6" w:space="0" w:color="C4C7C5"/>
+              <w:right w:val="single" w:sz="6" w:space="0" w:color="C4C7C5"/>
+            </w:tcBorders>
+            <w:tcMar>
+              <w:top w:w="120" w:type="dxa"/>
+              <w:left w:w="180" w:type="dxa"/>
+              <w:bottom w:w="120" w:type="dxa"/>
+              <w:right w:w="180" w:type="dxa"/>
+            </w:tcMar>
+            <w:vAlign w:val="center"/>
+          </w:tcPr>
+          <w:p>
+            <w:r>
+              <w:t>Volume 05 – Trust, Privacy &amp; Digital Identity</w:t>
             </w:r>
           </w:p>
         </w:tc>
@@ -4878,7 +5404,7 @@
           </w:tcPr>
           <w:p>
             <w:r>
-              <w:t>8</w:t>
+              <w:t>9</w:t>
             </w:r>
           </w:p>
         </w:tc>
@@ -4911,6 +5437,7 @@
                 <w:b/>
                 <w:bCs/>
               </w:rPr>
+              <w:lastRenderedPageBreak/>
               <w:t>Volume 05</w:t>
             </w:r>
           </w:p>
@@ -4959,7 +5486,7 @@
           </w:tcPr>
           <w:p>
             <w:r>
-              <w:t>8</w:t>
+              <w:t>13</w:t>
             </w:r>
           </w:p>
         </w:tc>
@@ -5040,7 +5567,14 @@
                 <w:b/>
                 <w:bCs/>
               </w:rPr>
-              <w:t>51</w:t>
+              <w:t>5</w:t>
+            </w:r>
+            <w:r>
+              <w:rPr>
+                <w:b/>
+                <w:bCs/>
+              </w:rPr>
+              <w:t>8</w:t>
             </w:r>
           </w:p>
         </w:tc>

</xml_diff>

<commit_message>
Add ATLAS friction and pattern volumes
Added new ATLAS Human Frictions and Patterns content, including the example catalog, learning and mobile volume docs, and several pattern documents. Also updated the registry and metrics files to reflect the new atlas entries and documentation set.
</commit_message>
<xml_diff>
--- a/atlas/Patterns/Pattern Volume Registry.docx.docx
+++ b/atlas/Patterns/Pattern Volume Registry.docx.docx
@@ -18,12 +18,6 @@
       </w:r>
     </w:p>
     <w:p>
-      <w:pPr>
-        <w:rPr>
-          <w:b/>
-          <w:bCs/>
-        </w:rPr>
-      </w:pPr>
       <w:r>
         <w:rPr>
           <w:b/>
@@ -41,7 +35,7 @@
         <w:t>Version:</w:t>
       </w:r>
       <w:r>
-        <w:t xml:space="preserve"> 2.1</w:t>
+        <w:t xml:space="preserve"> 2.2</w:t>
       </w:r>
     </w:p>
     <w:p>
@@ -53,16 +47,10 @@
         <w:t>Last Updated:</w:t>
       </w:r>
       <w:r>
-        <w:t xml:space="preserve"> 06 August 2026</w:t>
+        <w:t xml:space="preserve"> 13 August 2026</w:t>
       </w:r>
     </w:p>
     <w:p>
-      <w:pPr>
-        <w:rPr>
-          <w:b/>
-          <w:bCs/>
-        </w:rPr>
-      </w:pPr>
       <w:r>
         <w:rPr>
           <w:b/>
@@ -221,6 +209,12 @@
             <w:hideMark/>
           </w:tcPr>
           <w:p>
+            <w:pPr>
+              <w:rPr>
+                <w:b/>
+                <w:bCs/>
+              </w:rPr>
+            </w:pPr>
             <w:r>
               <w:rPr>
                 <w:b/>
@@ -302,6 +296,12 @@
             <w:hideMark/>
           </w:tcPr>
           <w:p>
+            <w:pPr>
+              <w:rPr>
+                <w:b/>
+                <w:bCs/>
+              </w:rPr>
+            </w:pPr>
             <w:r>
               <w:rPr>
                 <w:b/>
@@ -383,6 +383,12 @@
             <w:hideMark/>
           </w:tcPr>
           <w:p>
+            <w:pPr>
+              <w:rPr>
+                <w:b/>
+                <w:bCs/>
+              </w:rPr>
+            </w:pPr>
             <w:r>
               <w:rPr>
                 <w:b/>
@@ -464,6 +470,12 @@
             <w:hideMark/>
           </w:tcPr>
           <w:p>
+            <w:pPr>
+              <w:rPr>
+                <w:b/>
+                <w:bCs/>
+              </w:rPr>
+            </w:pPr>
             <w:r>
               <w:rPr>
                 <w:b/>
@@ -545,6 +557,12 @@
             <w:hideMark/>
           </w:tcPr>
           <w:p>
+            <w:pPr>
+              <w:rPr>
+                <w:b/>
+                <w:bCs/>
+              </w:rPr>
+            </w:pPr>
             <w:r>
               <w:rPr>
                 <w:b/>
@@ -626,6 +644,12 @@
             <w:hideMark/>
           </w:tcPr>
           <w:p>
+            <w:pPr>
+              <w:rPr>
+                <w:b/>
+                <w:bCs/>
+              </w:rPr>
+            </w:pPr>
             <w:r>
               <w:rPr>
                 <w:b/>
@@ -707,6 +731,12 @@
             <w:hideMark/>
           </w:tcPr>
           <w:p>
+            <w:pPr>
+              <w:rPr>
+                <w:b/>
+                <w:bCs/>
+              </w:rPr>
+            </w:pPr>
             <w:r>
               <w:rPr>
                 <w:b/>
@@ -788,6 +818,12 @@
             <w:hideMark/>
           </w:tcPr>
           <w:p>
+            <w:pPr>
+              <w:rPr>
+                <w:b/>
+                <w:bCs/>
+              </w:rPr>
+            </w:pPr>
             <w:r>
               <w:rPr>
                 <w:b/>
@@ -870,6 +906,12 @@
             <w:hideMark/>
           </w:tcPr>
           <w:p>
+            <w:pPr>
+              <w:rPr>
+                <w:b/>
+                <w:bCs/>
+              </w:rPr>
+            </w:pPr>
             <w:r>
               <w:rPr>
                 <w:b/>
@@ -951,6 +993,12 @@
             <w:hideMark/>
           </w:tcPr>
           <w:p>
+            <w:pPr>
+              <w:rPr>
+                <w:b/>
+                <w:bCs/>
+              </w:rPr>
+            </w:pPr>
             <w:r>
               <w:rPr>
                 <w:b/>
@@ -1032,6 +1080,12 @@
             <w:hideMark/>
           </w:tcPr>
           <w:p>
+            <w:pPr>
+              <w:rPr>
+                <w:b/>
+                <w:bCs/>
+              </w:rPr>
+            </w:pPr>
             <w:r>
               <w:rPr>
                 <w:b/>
@@ -1113,6 +1167,12 @@
             <w:hideMark/>
           </w:tcPr>
           <w:p>
+            <w:pPr>
+              <w:rPr>
+                <w:b/>
+                <w:bCs/>
+              </w:rPr>
+            </w:pPr>
             <w:r>
               <w:rPr>
                 <w:b/>
@@ -1194,6 +1254,12 @@
             <w:hideMark/>
           </w:tcPr>
           <w:p>
+            <w:pPr>
+              <w:rPr>
+                <w:b/>
+                <w:bCs/>
+              </w:rPr>
+            </w:pPr>
             <w:r>
               <w:rPr>
                 <w:b/>
@@ -1275,6 +1341,12 @@
             <w:hideMark/>
           </w:tcPr>
           <w:p>
+            <w:pPr>
+              <w:rPr>
+                <w:b/>
+                <w:bCs/>
+              </w:rPr>
+            </w:pPr>
             <w:r>
               <w:rPr>
                 <w:b/>
@@ -1356,6 +1428,12 @@
             <w:hideMark/>
           </w:tcPr>
           <w:p>
+            <w:pPr>
+              <w:rPr>
+                <w:b/>
+                <w:bCs/>
+              </w:rPr>
+            </w:pPr>
             <w:r>
               <w:rPr>
                 <w:b/>
@@ -1437,6 +1515,12 @@
             <w:hideMark/>
           </w:tcPr>
           <w:p>
+            <w:pPr>
+              <w:rPr>
+                <w:b/>
+                <w:bCs/>
+              </w:rPr>
+            </w:pPr>
             <w:r>
               <w:rPr>
                 <w:b/>
@@ -1518,6 +1602,12 @@
             <w:hideMark/>
           </w:tcPr>
           <w:p>
+            <w:pPr>
+              <w:rPr>
+                <w:b/>
+                <w:bCs/>
+              </w:rPr>
+            </w:pPr>
             <w:r>
               <w:rPr>
                 <w:b/>
@@ -1599,6 +1689,12 @@
             <w:hideMark/>
           </w:tcPr>
           <w:p>
+            <w:pPr>
+              <w:rPr>
+                <w:b/>
+                <w:bCs/>
+              </w:rPr>
+            </w:pPr>
             <w:r>
               <w:rPr>
                 <w:b/>
@@ -1680,6 +1776,12 @@
             <w:hideMark/>
           </w:tcPr>
           <w:p>
+            <w:pPr>
+              <w:rPr>
+                <w:b/>
+                <w:bCs/>
+              </w:rPr>
+            </w:pPr>
             <w:r>
               <w:rPr>
                 <w:b/>
@@ -1762,6 +1864,12 @@
             <w:hideMark/>
           </w:tcPr>
           <w:p>
+            <w:pPr>
+              <w:rPr>
+                <w:b/>
+                <w:bCs/>
+              </w:rPr>
+            </w:pPr>
             <w:r>
               <w:rPr>
                 <w:b/>
@@ -1843,6 +1951,12 @@
             <w:hideMark/>
           </w:tcPr>
           <w:p>
+            <w:pPr>
+              <w:rPr>
+                <w:b/>
+                <w:bCs/>
+              </w:rPr>
+            </w:pPr>
             <w:r>
               <w:rPr>
                 <w:b/>
@@ -1924,6 +2038,12 @@
             <w:hideMark/>
           </w:tcPr>
           <w:p>
+            <w:pPr>
+              <w:rPr>
+                <w:b/>
+                <w:bCs/>
+              </w:rPr>
+            </w:pPr>
             <w:r>
               <w:rPr>
                 <w:b/>
@@ -2005,6 +2125,12 @@
             <w:hideMark/>
           </w:tcPr>
           <w:p>
+            <w:pPr>
+              <w:rPr>
+                <w:b/>
+                <w:bCs/>
+              </w:rPr>
+            </w:pPr>
             <w:r>
               <w:rPr>
                 <w:b/>
@@ -2034,8 +2160,13 @@
           </w:tcPr>
           <w:p>
             <w:r>
-              <w:t>Adaptive System Behavior</w:t>
-            </w:r>
+              <w:t xml:space="preserve">Adaptive System </w:t>
+            </w:r>
+            <w:proofErr w:type="spellStart"/>
+            <w:r>
+              <w:t>Behavior</w:t>
+            </w:r>
+            <w:proofErr w:type="spellEnd"/>
           </w:p>
         </w:tc>
         <w:tc>
@@ -2086,6 +2217,12 @@
             <w:hideMark/>
           </w:tcPr>
           <w:p>
+            <w:pPr>
+              <w:rPr>
+                <w:b/>
+                <w:bCs/>
+              </w:rPr>
+            </w:pPr>
             <w:r>
               <w:rPr>
                 <w:b/>
@@ -2115,7 +2252,15 @@
           </w:tcPr>
           <w:p>
             <w:r>
-              <w:t>Human-Centered Computing</w:t>
+              <w:t>Human-</w:t>
+            </w:r>
+            <w:proofErr w:type="spellStart"/>
+            <w:r>
+              <w:t>Centered</w:t>
+            </w:r>
+            <w:proofErr w:type="spellEnd"/>
+            <w:r>
+              <w:t xml:space="preserve"> Computing</w:t>
             </w:r>
           </w:p>
         </w:tc>
@@ -2167,6 +2312,12 @@
             <w:hideMark/>
           </w:tcPr>
           <w:p>
+            <w:pPr>
+              <w:rPr>
+                <w:b/>
+                <w:bCs/>
+              </w:rPr>
+            </w:pPr>
             <w:r>
               <w:rPr>
                 <w:b/>
@@ -2248,6 +2399,12 @@
             <w:hideMark/>
           </w:tcPr>
           <w:p>
+            <w:pPr>
+              <w:rPr>
+                <w:b/>
+                <w:bCs/>
+              </w:rPr>
+            </w:pPr>
             <w:r>
               <w:rPr>
                 <w:b/>
@@ -2329,6 +2486,12 @@
             <w:hideMark/>
           </w:tcPr>
           <w:p>
+            <w:pPr>
+              <w:rPr>
+                <w:b/>
+                <w:bCs/>
+              </w:rPr>
+            </w:pPr>
             <w:r>
               <w:rPr>
                 <w:b/>
@@ -2410,6 +2573,12 @@
             <w:hideMark/>
           </w:tcPr>
           <w:p>
+            <w:pPr>
+              <w:rPr>
+                <w:b/>
+                <w:bCs/>
+              </w:rPr>
+            </w:pPr>
             <w:r>
               <w:rPr>
                 <w:b/>
@@ -2491,6 +2660,12 @@
             <w:hideMark/>
           </w:tcPr>
           <w:p>
+            <w:pPr>
+              <w:rPr>
+                <w:b/>
+                <w:bCs/>
+              </w:rPr>
+            </w:pPr>
             <w:r>
               <w:rPr>
                 <w:b/>
@@ -2572,6 +2747,12 @@
             <w:hideMark/>
           </w:tcPr>
           <w:p>
+            <w:pPr>
+              <w:rPr>
+                <w:b/>
+                <w:bCs/>
+              </w:rPr>
+            </w:pPr>
             <w:r>
               <w:rPr>
                 <w:b/>
@@ -2654,6 +2835,12 @@
             <w:hideMark/>
           </w:tcPr>
           <w:p>
+            <w:pPr>
+              <w:rPr>
+                <w:b/>
+                <w:bCs/>
+              </w:rPr>
+            </w:pPr>
             <w:r>
               <w:rPr>
                 <w:b/>
@@ -2735,6 +2922,12 @@
             <w:hideMark/>
           </w:tcPr>
           <w:p>
+            <w:pPr>
+              <w:rPr>
+                <w:b/>
+                <w:bCs/>
+              </w:rPr>
+            </w:pPr>
             <w:r>
               <w:rPr>
                 <w:b/>
@@ -2816,6 +3009,12 @@
             <w:hideMark/>
           </w:tcPr>
           <w:p>
+            <w:pPr>
+              <w:rPr>
+                <w:b/>
+                <w:bCs/>
+              </w:rPr>
+            </w:pPr>
             <w:r>
               <w:rPr>
                 <w:b/>
@@ -2897,6 +3096,12 @@
             <w:hideMark/>
           </w:tcPr>
           <w:p>
+            <w:pPr>
+              <w:rPr>
+                <w:b/>
+                <w:bCs/>
+              </w:rPr>
+            </w:pPr>
             <w:r>
               <w:rPr>
                 <w:b/>
@@ -2978,6 +3183,12 @@
             <w:hideMark/>
           </w:tcPr>
           <w:p>
+            <w:pPr>
+              <w:rPr>
+                <w:b/>
+                <w:bCs/>
+              </w:rPr>
+            </w:pPr>
             <w:r>
               <w:rPr>
                 <w:b/>
@@ -3059,6 +3270,12 @@
             <w:hideMark/>
           </w:tcPr>
           <w:p>
+            <w:pPr>
+              <w:rPr>
+                <w:b/>
+                <w:bCs/>
+              </w:rPr>
+            </w:pPr>
             <w:r>
               <w:rPr>
                 <w:b/>
@@ -3140,6 +3357,12 @@
             <w:hideMark/>
           </w:tcPr>
           <w:p>
+            <w:pPr>
+              <w:rPr>
+                <w:b/>
+                <w:bCs/>
+              </w:rPr>
+            </w:pPr>
             <w:r>
               <w:rPr>
                 <w:b/>
@@ -3221,6 +3444,12 @@
             <w:hideMark/>
           </w:tcPr>
           <w:p>
+            <w:pPr>
+              <w:rPr>
+                <w:b/>
+                <w:bCs/>
+              </w:rPr>
+            </w:pPr>
             <w:r>
               <w:rPr>
                 <w:b/>
@@ -3302,6 +3531,12 @@
             <w:hideMark/>
           </w:tcPr>
           <w:p>
+            <w:pPr>
+              <w:rPr>
+                <w:b/>
+                <w:bCs/>
+              </w:rPr>
+            </w:pPr>
             <w:r>
               <w:rPr>
                 <w:b/>
@@ -3383,6 +3618,12 @@
             <w:hideMark/>
           </w:tcPr>
           <w:p>
+            <w:pPr>
+              <w:rPr>
+                <w:b/>
+                <w:bCs/>
+              </w:rPr>
+            </w:pPr>
             <w:r>
               <w:rPr>
                 <w:b/>
@@ -3464,6 +3705,12 @@
             <w:hideMark/>
           </w:tcPr>
           <w:p>
+            <w:pPr>
+              <w:rPr>
+                <w:b/>
+                <w:bCs/>
+              </w:rPr>
+            </w:pPr>
             <w:r>
               <w:rPr>
                 <w:b/>
@@ -3546,6 +3793,12 @@
             <w:hideMark/>
           </w:tcPr>
           <w:p>
+            <w:pPr>
+              <w:rPr>
+                <w:b/>
+                <w:bCs/>
+              </w:rPr>
+            </w:pPr>
             <w:r>
               <w:rPr>
                 <w:b/>
@@ -3627,6 +3880,12 @@
             <w:hideMark/>
           </w:tcPr>
           <w:p>
+            <w:pPr>
+              <w:rPr>
+                <w:b/>
+                <w:bCs/>
+              </w:rPr>
+            </w:pPr>
             <w:r>
               <w:rPr>
                 <w:b/>
@@ -3708,6 +3967,12 @@
             <w:hideMark/>
           </w:tcPr>
           <w:p>
+            <w:pPr>
+              <w:rPr>
+                <w:b/>
+                <w:bCs/>
+              </w:rPr>
+            </w:pPr>
             <w:r>
               <w:rPr>
                 <w:b/>
@@ -3789,6 +4054,12 @@
             <w:hideMark/>
           </w:tcPr>
           <w:p>
+            <w:pPr>
+              <w:rPr>
+                <w:b/>
+                <w:bCs/>
+              </w:rPr>
+            </w:pPr>
             <w:r>
               <w:rPr>
                 <w:b/>
@@ -3870,6 +4141,12 @@
             <w:hideMark/>
           </w:tcPr>
           <w:p>
+            <w:pPr>
+              <w:rPr>
+                <w:b/>
+                <w:bCs/>
+              </w:rPr>
+            </w:pPr>
             <w:r>
               <w:rPr>
                 <w:b/>
@@ -3951,6 +4228,12 @@
             <w:hideMark/>
           </w:tcPr>
           <w:p>
+            <w:pPr>
+              <w:rPr>
+                <w:b/>
+                <w:bCs/>
+              </w:rPr>
+            </w:pPr>
             <w:r>
               <w:rPr>
                 <w:b/>
@@ -4032,6 +4315,12 @@
             <w:hideMark/>
           </w:tcPr>
           <w:p>
+            <w:pPr>
+              <w:rPr>
+                <w:b/>
+                <w:bCs/>
+              </w:rPr>
+            </w:pPr>
             <w:r>
               <w:rPr>
                 <w:b/>
@@ -4113,6 +4402,12 @@
             <w:hideMark/>
           </w:tcPr>
           <w:p>
+            <w:pPr>
+              <w:rPr>
+                <w:b/>
+                <w:bCs/>
+              </w:rPr>
+            </w:pPr>
             <w:r>
               <w:rPr>
                 <w:b/>
@@ -4194,6 +4489,12 @@
             <w:hideMark/>
           </w:tcPr>
           <w:p>
+            <w:pPr>
+              <w:rPr>
+                <w:b/>
+                <w:bCs/>
+              </w:rPr>
+            </w:pPr>
             <w:r>
               <w:rPr>
                 <w:b/>
@@ -4275,6 +4576,12 @@
             <w:hideMark/>
           </w:tcPr>
           <w:p>
+            <w:pPr>
+              <w:rPr>
+                <w:b/>
+                <w:bCs/>
+              </w:rPr>
+            </w:pPr>
             <w:r>
               <w:rPr>
                 <w:b/>
@@ -4356,6 +4663,12 @@
             <w:hideMark/>
           </w:tcPr>
           <w:p>
+            <w:pPr>
+              <w:rPr>
+                <w:b/>
+                <w:bCs/>
+              </w:rPr>
+            </w:pPr>
             <w:r>
               <w:rPr>
                 <w:b/>
@@ -4435,6 +4748,7 @@
               <w:right w:w="180" w:type="dxa"/>
             </w:tcMar>
             <w:vAlign w:val="center"/>
+            <w:hideMark/>
           </w:tcPr>
           <w:p>
             <w:pPr>
@@ -4468,29 +4782,31 @@
               <w:right w:w="180" w:type="dxa"/>
             </w:tcMar>
             <w:vAlign w:val="center"/>
-          </w:tcPr>
-          <w:p>
-            <w:r>
-              <w:t xml:space="preserve"> Authentication Burden</w:t>
-            </w:r>
-          </w:p>
-        </w:tc>
-        <w:tc>
-          <w:tcPr>
-            <w:tcW w:w="0" w:type="auto"/>
-            <w:tcBorders>
-              <w:top w:val="single" w:sz="6" w:space="0" w:color="C4C7C5"/>
-              <w:left w:val="single" w:sz="6" w:space="0" w:color="C4C7C5"/>
-              <w:bottom w:val="single" w:sz="6" w:space="0" w:color="C4C7C5"/>
-              <w:right w:val="single" w:sz="6" w:space="0" w:color="C4C7C5"/>
-            </w:tcBorders>
-            <w:tcMar>
-              <w:top w:w="120" w:type="dxa"/>
-              <w:left w:w="180" w:type="dxa"/>
-              <w:bottom w:w="120" w:type="dxa"/>
-              <w:right w:w="180" w:type="dxa"/>
-            </w:tcMar>
-            <w:vAlign w:val="center"/>
+            <w:hideMark/>
+          </w:tcPr>
+          <w:p>
+            <w:r>
+              <w:t>Authentication Burden</w:t>
+            </w:r>
+          </w:p>
+        </w:tc>
+        <w:tc>
+          <w:tcPr>
+            <w:tcW w:w="0" w:type="auto"/>
+            <w:tcBorders>
+              <w:top w:val="single" w:sz="6" w:space="0" w:color="C4C7C5"/>
+              <w:left w:val="single" w:sz="6" w:space="0" w:color="C4C7C5"/>
+              <w:bottom w:val="single" w:sz="6" w:space="0" w:color="C4C7C5"/>
+              <w:right w:val="single" w:sz="6" w:space="0" w:color="C4C7C5"/>
+            </w:tcBorders>
+            <w:tcMar>
+              <w:top w:w="120" w:type="dxa"/>
+              <w:left w:w="180" w:type="dxa"/>
+              <w:bottom w:w="120" w:type="dxa"/>
+              <w:right w:w="180" w:type="dxa"/>
+            </w:tcMar>
+            <w:vAlign w:val="center"/>
+            <w:hideMark/>
           </w:tcPr>
           <w:p>
             <w:r>
@@ -4519,6 +4835,7 @@
               <w:right w:w="180" w:type="dxa"/>
             </w:tcMar>
             <w:vAlign w:val="center"/>
+            <w:hideMark/>
           </w:tcPr>
           <w:p>
             <w:pPr>
@@ -4532,56 +4849,51 @@
                 <w:b/>
                 <w:bCs/>
               </w:rPr>
-              <w:t>PAT-05</w:t>
-            </w:r>
-            <w:r>
-              <w:rPr>
-                <w:b/>
-                <w:bCs/>
-              </w:rPr>
-              <w:t>4</w:t>
-            </w:r>
-          </w:p>
-        </w:tc>
-        <w:tc>
-          <w:tcPr>
-            <w:tcW w:w="0" w:type="auto"/>
-            <w:tcBorders>
-              <w:top w:val="single" w:sz="6" w:space="0" w:color="C4C7C5"/>
-              <w:left w:val="single" w:sz="6" w:space="0" w:color="C4C7C5"/>
-              <w:bottom w:val="single" w:sz="6" w:space="0" w:color="C4C7C5"/>
-              <w:right w:val="single" w:sz="6" w:space="0" w:color="C4C7C5"/>
-            </w:tcBorders>
-            <w:tcMar>
-              <w:top w:w="120" w:type="dxa"/>
-              <w:left w:w="180" w:type="dxa"/>
-              <w:bottom w:w="120" w:type="dxa"/>
-              <w:right w:w="180" w:type="dxa"/>
-            </w:tcMar>
-            <w:vAlign w:val="center"/>
-          </w:tcPr>
-          <w:p>
-            <w:r>
-              <w:t xml:space="preserve"> Credential Lifecycle Management</w:t>
-            </w:r>
-          </w:p>
-        </w:tc>
-        <w:tc>
-          <w:tcPr>
-            <w:tcW w:w="0" w:type="auto"/>
-            <w:tcBorders>
-              <w:top w:val="single" w:sz="6" w:space="0" w:color="C4C7C5"/>
-              <w:left w:val="single" w:sz="6" w:space="0" w:color="C4C7C5"/>
-              <w:bottom w:val="single" w:sz="6" w:space="0" w:color="C4C7C5"/>
-              <w:right w:val="single" w:sz="6" w:space="0" w:color="C4C7C5"/>
-            </w:tcBorders>
-            <w:tcMar>
-              <w:top w:w="120" w:type="dxa"/>
-              <w:left w:w="180" w:type="dxa"/>
-              <w:bottom w:w="120" w:type="dxa"/>
-              <w:right w:w="180" w:type="dxa"/>
-            </w:tcMar>
-            <w:vAlign w:val="center"/>
+              <w:t>PAT-054</w:t>
+            </w:r>
+          </w:p>
+        </w:tc>
+        <w:tc>
+          <w:tcPr>
+            <w:tcW w:w="0" w:type="auto"/>
+            <w:tcBorders>
+              <w:top w:val="single" w:sz="6" w:space="0" w:color="C4C7C5"/>
+              <w:left w:val="single" w:sz="6" w:space="0" w:color="C4C7C5"/>
+              <w:bottom w:val="single" w:sz="6" w:space="0" w:color="C4C7C5"/>
+              <w:right w:val="single" w:sz="6" w:space="0" w:color="C4C7C5"/>
+            </w:tcBorders>
+            <w:tcMar>
+              <w:top w:w="120" w:type="dxa"/>
+              <w:left w:w="180" w:type="dxa"/>
+              <w:bottom w:w="120" w:type="dxa"/>
+              <w:right w:w="180" w:type="dxa"/>
+            </w:tcMar>
+            <w:vAlign w:val="center"/>
+            <w:hideMark/>
+          </w:tcPr>
+          <w:p>
+            <w:r>
+              <w:t>Credential Lifecycle Management</w:t>
+            </w:r>
+          </w:p>
+        </w:tc>
+        <w:tc>
+          <w:tcPr>
+            <w:tcW w:w="0" w:type="auto"/>
+            <w:tcBorders>
+              <w:top w:val="single" w:sz="6" w:space="0" w:color="C4C7C5"/>
+              <w:left w:val="single" w:sz="6" w:space="0" w:color="C4C7C5"/>
+              <w:bottom w:val="single" w:sz="6" w:space="0" w:color="C4C7C5"/>
+              <w:right w:val="single" w:sz="6" w:space="0" w:color="C4C7C5"/>
+            </w:tcBorders>
+            <w:tcMar>
+              <w:top w:w="120" w:type="dxa"/>
+              <w:left w:w="180" w:type="dxa"/>
+              <w:bottom w:w="120" w:type="dxa"/>
+              <w:right w:w="180" w:type="dxa"/>
+            </w:tcMar>
+            <w:vAlign w:val="center"/>
+            <w:hideMark/>
           </w:tcPr>
           <w:p>
             <w:r>
@@ -4610,6 +4922,7 @@
               <w:right w:w="180" w:type="dxa"/>
             </w:tcMar>
             <w:vAlign w:val="center"/>
+            <w:hideMark/>
           </w:tcPr>
           <w:p>
             <w:pPr>
@@ -4623,33 +4936,27 @@
                 <w:b/>
                 <w:bCs/>
               </w:rPr>
-              <w:t>PAT-05</w:t>
-            </w:r>
-            <w:r>
-              <w:rPr>
-                <w:b/>
-                <w:bCs/>
-              </w:rPr>
-              <w:t>5</w:t>
-            </w:r>
-          </w:p>
-        </w:tc>
-        <w:tc>
-          <w:tcPr>
-            <w:tcW w:w="0" w:type="auto"/>
-            <w:tcBorders>
-              <w:top w:val="single" w:sz="6" w:space="0" w:color="C4C7C5"/>
-              <w:left w:val="single" w:sz="6" w:space="0" w:color="C4C7C5"/>
-              <w:bottom w:val="single" w:sz="6" w:space="0" w:color="C4C7C5"/>
-              <w:right w:val="single" w:sz="6" w:space="0" w:color="C4C7C5"/>
-            </w:tcBorders>
-            <w:tcMar>
-              <w:top w:w="120" w:type="dxa"/>
-              <w:left w:w="180" w:type="dxa"/>
-              <w:bottom w:w="120" w:type="dxa"/>
-              <w:right w:w="180" w:type="dxa"/>
-            </w:tcMar>
-            <w:vAlign w:val="center"/>
+              <w:t>PAT-055</w:t>
+            </w:r>
+          </w:p>
+        </w:tc>
+        <w:tc>
+          <w:tcPr>
+            <w:tcW w:w="0" w:type="auto"/>
+            <w:tcBorders>
+              <w:top w:val="single" w:sz="6" w:space="0" w:color="C4C7C5"/>
+              <w:left w:val="single" w:sz="6" w:space="0" w:color="C4C7C5"/>
+              <w:bottom w:val="single" w:sz="6" w:space="0" w:color="C4C7C5"/>
+              <w:right w:val="single" w:sz="6" w:space="0" w:color="C4C7C5"/>
+            </w:tcBorders>
+            <w:tcMar>
+              <w:top w:w="120" w:type="dxa"/>
+              <w:left w:w="180" w:type="dxa"/>
+              <w:bottom w:w="120" w:type="dxa"/>
+              <w:right w:w="180" w:type="dxa"/>
+            </w:tcMar>
+            <w:vAlign w:val="center"/>
+            <w:hideMark/>
           </w:tcPr>
           <w:p>
             <w:r>
@@ -4673,6 +4980,7 @@
               <w:right w:w="180" w:type="dxa"/>
             </w:tcMar>
             <w:vAlign w:val="center"/>
+            <w:hideMark/>
           </w:tcPr>
           <w:p>
             <w:r>
@@ -4701,6 +5009,7 @@
               <w:right w:w="180" w:type="dxa"/>
             </w:tcMar>
             <w:vAlign w:val="center"/>
+            <w:hideMark/>
           </w:tcPr>
           <w:p>
             <w:pPr>
@@ -4714,33 +5023,27 @@
                 <w:b/>
                 <w:bCs/>
               </w:rPr>
-              <w:t>PAT-05</w:t>
-            </w:r>
-            <w:r>
-              <w:rPr>
-                <w:b/>
-                <w:bCs/>
-              </w:rPr>
-              <w:t>6</w:t>
-            </w:r>
-          </w:p>
-        </w:tc>
-        <w:tc>
-          <w:tcPr>
-            <w:tcW w:w="0" w:type="auto"/>
-            <w:tcBorders>
-              <w:top w:val="single" w:sz="6" w:space="0" w:color="C4C7C5"/>
-              <w:left w:val="single" w:sz="6" w:space="0" w:color="C4C7C5"/>
-              <w:bottom w:val="single" w:sz="6" w:space="0" w:color="C4C7C5"/>
-              <w:right w:val="single" w:sz="6" w:space="0" w:color="C4C7C5"/>
-            </w:tcBorders>
-            <w:tcMar>
-              <w:top w:w="120" w:type="dxa"/>
-              <w:left w:w="180" w:type="dxa"/>
-              <w:bottom w:w="120" w:type="dxa"/>
-              <w:right w:w="180" w:type="dxa"/>
-            </w:tcMar>
-            <w:vAlign w:val="center"/>
+              <w:t>PAT-056</w:t>
+            </w:r>
+          </w:p>
+        </w:tc>
+        <w:tc>
+          <w:tcPr>
+            <w:tcW w:w="0" w:type="auto"/>
+            <w:tcBorders>
+              <w:top w:val="single" w:sz="6" w:space="0" w:color="C4C7C5"/>
+              <w:left w:val="single" w:sz="6" w:space="0" w:color="C4C7C5"/>
+              <w:bottom w:val="single" w:sz="6" w:space="0" w:color="C4C7C5"/>
+              <w:right w:val="single" w:sz="6" w:space="0" w:color="C4C7C5"/>
+            </w:tcBorders>
+            <w:tcMar>
+              <w:top w:w="120" w:type="dxa"/>
+              <w:left w:w="180" w:type="dxa"/>
+              <w:bottom w:w="120" w:type="dxa"/>
+              <w:right w:w="180" w:type="dxa"/>
+            </w:tcMar>
+            <w:vAlign w:val="center"/>
+            <w:hideMark/>
           </w:tcPr>
           <w:p>
             <w:r>
@@ -4764,6 +5067,7 @@
               <w:right w:w="180" w:type="dxa"/>
             </w:tcMar>
             <w:vAlign w:val="center"/>
+            <w:hideMark/>
           </w:tcPr>
           <w:p>
             <w:r>
@@ -4792,6 +5096,7 @@
               <w:right w:w="180" w:type="dxa"/>
             </w:tcMar>
             <w:vAlign w:val="center"/>
+            <w:hideMark/>
           </w:tcPr>
           <w:p>
             <w:pPr>
@@ -4805,33 +5110,27 @@
                 <w:b/>
                 <w:bCs/>
               </w:rPr>
-              <w:t>PAT-05</w:t>
-            </w:r>
-            <w:r>
-              <w:rPr>
-                <w:b/>
-                <w:bCs/>
-              </w:rPr>
-              <w:t>7</w:t>
-            </w:r>
-          </w:p>
-        </w:tc>
-        <w:tc>
-          <w:tcPr>
-            <w:tcW w:w="0" w:type="auto"/>
-            <w:tcBorders>
-              <w:top w:val="single" w:sz="6" w:space="0" w:color="C4C7C5"/>
-              <w:left w:val="single" w:sz="6" w:space="0" w:color="C4C7C5"/>
-              <w:bottom w:val="single" w:sz="6" w:space="0" w:color="C4C7C5"/>
-              <w:right w:val="single" w:sz="6" w:space="0" w:color="C4C7C5"/>
-            </w:tcBorders>
-            <w:tcMar>
-              <w:top w:w="120" w:type="dxa"/>
-              <w:left w:w="180" w:type="dxa"/>
-              <w:bottom w:w="120" w:type="dxa"/>
-              <w:right w:w="180" w:type="dxa"/>
-            </w:tcMar>
-            <w:vAlign w:val="center"/>
+              <w:t>PAT-057</w:t>
+            </w:r>
+          </w:p>
+        </w:tc>
+        <w:tc>
+          <w:tcPr>
+            <w:tcW w:w="0" w:type="auto"/>
+            <w:tcBorders>
+              <w:top w:val="single" w:sz="6" w:space="0" w:color="C4C7C5"/>
+              <w:left w:val="single" w:sz="6" w:space="0" w:color="C4C7C5"/>
+              <w:bottom w:val="single" w:sz="6" w:space="0" w:color="C4C7C5"/>
+              <w:right w:val="single" w:sz="6" w:space="0" w:color="C4C7C5"/>
+            </w:tcBorders>
+            <w:tcMar>
+              <w:top w:w="120" w:type="dxa"/>
+              <w:left w:w="180" w:type="dxa"/>
+              <w:bottom w:w="120" w:type="dxa"/>
+              <w:right w:w="180" w:type="dxa"/>
+            </w:tcMar>
+            <w:vAlign w:val="center"/>
+            <w:hideMark/>
           </w:tcPr>
           <w:p>
             <w:r>
@@ -4855,6 +5154,7 @@
               <w:right w:w="180" w:type="dxa"/>
             </w:tcMar>
             <w:vAlign w:val="center"/>
+            <w:hideMark/>
           </w:tcPr>
           <w:p>
             <w:r>
@@ -4883,6 +5183,7 @@
               <w:right w:w="180" w:type="dxa"/>
             </w:tcMar>
             <w:vAlign w:val="center"/>
+            <w:hideMark/>
           </w:tcPr>
           <w:p>
             <w:pPr>
@@ -4896,60 +5197,542 @@
                 <w:b/>
                 <w:bCs/>
               </w:rPr>
-              <w:t>PAT-05</w:t>
-            </w:r>
-            <w:r>
-              <w:rPr>
-                <w:b/>
-                <w:bCs/>
-              </w:rPr>
-              <w:t>8</w:t>
-            </w:r>
-          </w:p>
-        </w:tc>
-        <w:tc>
-          <w:tcPr>
-            <w:tcW w:w="0" w:type="auto"/>
-            <w:tcBorders>
-              <w:top w:val="single" w:sz="6" w:space="0" w:color="C4C7C5"/>
-              <w:left w:val="single" w:sz="6" w:space="0" w:color="C4C7C5"/>
-              <w:bottom w:val="single" w:sz="6" w:space="0" w:color="C4C7C5"/>
-              <w:right w:val="single" w:sz="6" w:space="0" w:color="C4C7C5"/>
-            </w:tcBorders>
-            <w:tcMar>
-              <w:top w:w="120" w:type="dxa"/>
-              <w:left w:w="180" w:type="dxa"/>
-              <w:bottom w:w="120" w:type="dxa"/>
-              <w:right w:w="180" w:type="dxa"/>
-            </w:tcMar>
-            <w:vAlign w:val="center"/>
-          </w:tcPr>
-          <w:p>
-            <w:r>
-              <w:t xml:space="preserve"> Authentication Decision Behaviour</w:t>
-            </w:r>
-          </w:p>
-        </w:tc>
-        <w:tc>
-          <w:tcPr>
-            <w:tcW w:w="0" w:type="auto"/>
-            <w:tcBorders>
-              <w:top w:val="single" w:sz="6" w:space="0" w:color="C4C7C5"/>
-              <w:left w:val="single" w:sz="6" w:space="0" w:color="C4C7C5"/>
-              <w:bottom w:val="single" w:sz="6" w:space="0" w:color="C4C7C5"/>
-              <w:right w:val="single" w:sz="6" w:space="0" w:color="C4C7C5"/>
-            </w:tcBorders>
-            <w:tcMar>
-              <w:top w:w="120" w:type="dxa"/>
-              <w:left w:w="180" w:type="dxa"/>
-              <w:bottom w:w="120" w:type="dxa"/>
-              <w:right w:w="180" w:type="dxa"/>
-            </w:tcMar>
-            <w:vAlign w:val="center"/>
+              <w:t>PAT-058</w:t>
+            </w:r>
+          </w:p>
+        </w:tc>
+        <w:tc>
+          <w:tcPr>
+            <w:tcW w:w="0" w:type="auto"/>
+            <w:tcBorders>
+              <w:top w:val="single" w:sz="6" w:space="0" w:color="C4C7C5"/>
+              <w:left w:val="single" w:sz="6" w:space="0" w:color="C4C7C5"/>
+              <w:bottom w:val="single" w:sz="6" w:space="0" w:color="C4C7C5"/>
+              <w:right w:val="single" w:sz="6" w:space="0" w:color="C4C7C5"/>
+            </w:tcBorders>
+            <w:tcMar>
+              <w:top w:w="120" w:type="dxa"/>
+              <w:left w:w="180" w:type="dxa"/>
+              <w:bottom w:w="120" w:type="dxa"/>
+              <w:right w:w="180" w:type="dxa"/>
+            </w:tcMar>
+            <w:vAlign w:val="center"/>
+            <w:hideMark/>
+          </w:tcPr>
+          <w:p>
+            <w:r>
+              <w:t>Authentication Decision Behaviour</w:t>
+            </w:r>
+          </w:p>
+        </w:tc>
+        <w:tc>
+          <w:tcPr>
+            <w:tcW w:w="0" w:type="auto"/>
+            <w:tcBorders>
+              <w:top w:val="single" w:sz="6" w:space="0" w:color="C4C7C5"/>
+              <w:left w:val="single" w:sz="6" w:space="0" w:color="C4C7C5"/>
+              <w:bottom w:val="single" w:sz="6" w:space="0" w:color="C4C7C5"/>
+              <w:right w:val="single" w:sz="6" w:space="0" w:color="C4C7C5"/>
+            </w:tcBorders>
+            <w:tcMar>
+              <w:top w:w="120" w:type="dxa"/>
+              <w:left w:w="180" w:type="dxa"/>
+              <w:bottom w:w="120" w:type="dxa"/>
+              <w:right w:w="180" w:type="dxa"/>
+            </w:tcMar>
+            <w:vAlign w:val="center"/>
+            <w:hideMark/>
           </w:tcPr>
           <w:p>
             <w:r>
               <w:t>Volume 05 – Trust, Privacy &amp; Digital Identity</w:t>
+            </w:r>
+          </w:p>
+        </w:tc>
+      </w:tr>
+      <w:tr>
+        <w:trPr>
+          <w:tblCellSpacing w:w="15" w:type="dxa"/>
+        </w:trPr>
+        <w:tc>
+          <w:tcPr>
+            <w:tcW w:w="0" w:type="auto"/>
+            <w:tcBorders>
+              <w:top w:val="single" w:sz="6" w:space="0" w:color="C4C7C5"/>
+              <w:left w:val="single" w:sz="6" w:space="0" w:color="C4C7C5"/>
+              <w:bottom w:val="single" w:sz="6" w:space="0" w:color="C4C7C5"/>
+              <w:right w:val="single" w:sz="6" w:space="0" w:color="C4C7C5"/>
+            </w:tcBorders>
+            <w:tcMar>
+              <w:top w:w="120" w:type="dxa"/>
+              <w:left w:w="180" w:type="dxa"/>
+              <w:bottom w:w="120" w:type="dxa"/>
+              <w:right w:w="180" w:type="dxa"/>
+            </w:tcMar>
+            <w:vAlign w:val="center"/>
+            <w:hideMark/>
+          </w:tcPr>
+          <w:p>
+            <w:r>
+              <w:rPr>
+                <w:b/>
+                <w:bCs/>
+              </w:rPr>
+              <w:t>PAT-059</w:t>
+            </w:r>
+          </w:p>
+        </w:tc>
+        <w:tc>
+          <w:tcPr>
+            <w:tcW w:w="0" w:type="auto"/>
+            <w:tcBorders>
+              <w:top w:val="single" w:sz="6" w:space="0" w:color="C4C7C5"/>
+              <w:left w:val="single" w:sz="6" w:space="0" w:color="C4C7C5"/>
+              <w:bottom w:val="single" w:sz="6" w:space="0" w:color="C4C7C5"/>
+              <w:right w:val="single" w:sz="6" w:space="0" w:color="C4C7C5"/>
+            </w:tcBorders>
+            <w:tcMar>
+              <w:top w:w="120" w:type="dxa"/>
+              <w:left w:w="180" w:type="dxa"/>
+              <w:bottom w:w="120" w:type="dxa"/>
+              <w:right w:w="180" w:type="dxa"/>
+            </w:tcMar>
+            <w:vAlign w:val="center"/>
+            <w:hideMark/>
+          </w:tcPr>
+          <w:p>
+            <w:r>
+              <w:t>Prerequisite Dependency</w:t>
+            </w:r>
+          </w:p>
+        </w:tc>
+        <w:tc>
+          <w:tcPr>
+            <w:tcW w:w="0" w:type="auto"/>
+            <w:tcBorders>
+              <w:top w:val="single" w:sz="6" w:space="0" w:color="C4C7C5"/>
+              <w:left w:val="single" w:sz="6" w:space="0" w:color="C4C7C5"/>
+              <w:bottom w:val="single" w:sz="6" w:space="0" w:color="C4C7C5"/>
+              <w:right w:val="single" w:sz="6" w:space="0" w:color="C4C7C5"/>
+            </w:tcBorders>
+            <w:tcMar>
+              <w:top w:w="120" w:type="dxa"/>
+              <w:left w:w="180" w:type="dxa"/>
+              <w:bottom w:w="120" w:type="dxa"/>
+              <w:right w:w="180" w:type="dxa"/>
+            </w:tcMar>
+            <w:vAlign w:val="center"/>
+            <w:hideMark/>
+          </w:tcPr>
+          <w:p>
+            <w:r>
+              <w:t>Volume 02 – Knowledge &amp; Information Behaviour</w:t>
+            </w:r>
+          </w:p>
+        </w:tc>
+      </w:tr>
+      <w:tr>
+        <w:trPr>
+          <w:tblCellSpacing w:w="15" w:type="dxa"/>
+        </w:trPr>
+        <w:tc>
+          <w:tcPr>
+            <w:tcW w:w="0" w:type="auto"/>
+            <w:tcBorders>
+              <w:top w:val="single" w:sz="6" w:space="0" w:color="C4C7C5"/>
+              <w:left w:val="single" w:sz="6" w:space="0" w:color="C4C7C5"/>
+              <w:bottom w:val="single" w:sz="6" w:space="0" w:color="C4C7C5"/>
+              <w:right w:val="single" w:sz="6" w:space="0" w:color="C4C7C5"/>
+            </w:tcBorders>
+            <w:tcMar>
+              <w:top w:w="120" w:type="dxa"/>
+              <w:left w:w="180" w:type="dxa"/>
+              <w:bottom w:w="120" w:type="dxa"/>
+              <w:right w:w="180" w:type="dxa"/>
+            </w:tcMar>
+            <w:vAlign w:val="center"/>
+            <w:hideMark/>
+          </w:tcPr>
+          <w:p>
+            <w:r>
+              <w:rPr>
+                <w:b/>
+                <w:bCs/>
+              </w:rPr>
+              <w:t>PAT-060</w:t>
+            </w:r>
+          </w:p>
+        </w:tc>
+        <w:tc>
+          <w:tcPr>
+            <w:tcW w:w="0" w:type="auto"/>
+            <w:tcBorders>
+              <w:top w:val="single" w:sz="6" w:space="0" w:color="C4C7C5"/>
+              <w:left w:val="single" w:sz="6" w:space="0" w:color="C4C7C5"/>
+              <w:bottom w:val="single" w:sz="6" w:space="0" w:color="C4C7C5"/>
+              <w:right w:val="single" w:sz="6" w:space="0" w:color="C4C7C5"/>
+            </w:tcBorders>
+            <w:tcMar>
+              <w:top w:w="120" w:type="dxa"/>
+              <w:left w:w="180" w:type="dxa"/>
+              <w:bottom w:w="120" w:type="dxa"/>
+              <w:right w:w="180" w:type="dxa"/>
+            </w:tcMar>
+            <w:vAlign w:val="center"/>
+            <w:hideMark/>
+          </w:tcPr>
+          <w:p>
+            <w:r>
+              <w:t>Learning Path Navigation</w:t>
+            </w:r>
+          </w:p>
+        </w:tc>
+        <w:tc>
+          <w:tcPr>
+            <w:tcW w:w="0" w:type="auto"/>
+            <w:tcBorders>
+              <w:top w:val="single" w:sz="6" w:space="0" w:color="C4C7C5"/>
+              <w:left w:val="single" w:sz="6" w:space="0" w:color="C4C7C5"/>
+              <w:bottom w:val="single" w:sz="6" w:space="0" w:color="C4C7C5"/>
+              <w:right w:val="single" w:sz="6" w:space="0" w:color="C4C7C5"/>
+            </w:tcBorders>
+            <w:tcMar>
+              <w:top w:w="120" w:type="dxa"/>
+              <w:left w:w="180" w:type="dxa"/>
+              <w:bottom w:w="120" w:type="dxa"/>
+              <w:right w:w="180" w:type="dxa"/>
+            </w:tcMar>
+            <w:vAlign w:val="center"/>
+            <w:hideMark/>
+          </w:tcPr>
+          <w:p>
+            <w:r>
+              <w:t>Volume 04 – Interface &amp; Navigation Behaviour</w:t>
+            </w:r>
+          </w:p>
+        </w:tc>
+      </w:tr>
+      <w:tr>
+        <w:trPr>
+          <w:tblCellSpacing w:w="15" w:type="dxa"/>
+        </w:trPr>
+        <w:tc>
+          <w:tcPr>
+            <w:tcW w:w="0" w:type="auto"/>
+            <w:tcBorders>
+              <w:top w:val="single" w:sz="6" w:space="0" w:color="C4C7C5"/>
+              <w:left w:val="single" w:sz="6" w:space="0" w:color="C4C7C5"/>
+              <w:bottom w:val="single" w:sz="6" w:space="0" w:color="C4C7C5"/>
+              <w:right w:val="single" w:sz="6" w:space="0" w:color="C4C7C5"/>
+            </w:tcBorders>
+            <w:tcMar>
+              <w:top w:w="120" w:type="dxa"/>
+              <w:left w:w="180" w:type="dxa"/>
+              <w:bottom w:w="120" w:type="dxa"/>
+              <w:right w:w="180" w:type="dxa"/>
+            </w:tcMar>
+            <w:vAlign w:val="center"/>
+            <w:hideMark/>
+          </w:tcPr>
+          <w:p>
+            <w:r>
+              <w:rPr>
+                <w:b/>
+                <w:bCs/>
+              </w:rPr>
+              <w:t>PAT-061</w:t>
+            </w:r>
+          </w:p>
+        </w:tc>
+        <w:tc>
+          <w:tcPr>
+            <w:tcW w:w="0" w:type="auto"/>
+            <w:tcBorders>
+              <w:top w:val="single" w:sz="6" w:space="0" w:color="C4C7C5"/>
+              <w:left w:val="single" w:sz="6" w:space="0" w:color="C4C7C5"/>
+              <w:bottom w:val="single" w:sz="6" w:space="0" w:color="C4C7C5"/>
+              <w:right w:val="single" w:sz="6" w:space="0" w:color="C4C7C5"/>
+            </w:tcBorders>
+            <w:tcMar>
+              <w:top w:w="120" w:type="dxa"/>
+              <w:left w:w="180" w:type="dxa"/>
+              <w:bottom w:w="120" w:type="dxa"/>
+              <w:right w:w="180" w:type="dxa"/>
+            </w:tcMar>
+            <w:vAlign w:val="center"/>
+            <w:hideMark/>
+          </w:tcPr>
+          <w:p>
+            <w:r>
+              <w:t>Knowledge Transfer</w:t>
+            </w:r>
+          </w:p>
+        </w:tc>
+        <w:tc>
+          <w:tcPr>
+            <w:tcW w:w="0" w:type="auto"/>
+            <w:tcBorders>
+              <w:top w:val="single" w:sz="6" w:space="0" w:color="C4C7C5"/>
+              <w:left w:val="single" w:sz="6" w:space="0" w:color="C4C7C5"/>
+              <w:bottom w:val="single" w:sz="6" w:space="0" w:color="C4C7C5"/>
+              <w:right w:val="single" w:sz="6" w:space="0" w:color="C4C7C5"/>
+            </w:tcBorders>
+            <w:tcMar>
+              <w:top w:w="120" w:type="dxa"/>
+              <w:left w:w="180" w:type="dxa"/>
+              <w:bottom w:w="120" w:type="dxa"/>
+              <w:right w:w="180" w:type="dxa"/>
+            </w:tcMar>
+            <w:vAlign w:val="center"/>
+            <w:hideMark/>
+          </w:tcPr>
+          <w:p>
+            <w:r>
+              <w:t>Volume 02 – Knowledge &amp; Information Behaviour</w:t>
+            </w:r>
+          </w:p>
+        </w:tc>
+      </w:tr>
+      <w:tr>
+        <w:trPr>
+          <w:tblCellSpacing w:w="15" w:type="dxa"/>
+        </w:trPr>
+        <w:tc>
+          <w:tcPr>
+            <w:tcW w:w="0" w:type="auto"/>
+            <w:tcBorders>
+              <w:top w:val="single" w:sz="6" w:space="0" w:color="C4C7C5"/>
+              <w:left w:val="single" w:sz="6" w:space="0" w:color="C4C7C5"/>
+              <w:bottom w:val="single" w:sz="6" w:space="0" w:color="C4C7C5"/>
+              <w:right w:val="single" w:sz="6" w:space="0" w:color="C4C7C5"/>
+            </w:tcBorders>
+            <w:tcMar>
+              <w:top w:w="120" w:type="dxa"/>
+              <w:left w:w="180" w:type="dxa"/>
+              <w:bottom w:w="120" w:type="dxa"/>
+              <w:right w:w="180" w:type="dxa"/>
+            </w:tcMar>
+            <w:vAlign w:val="center"/>
+            <w:hideMark/>
+          </w:tcPr>
+          <w:p>
+            <w:r>
+              <w:rPr>
+                <w:b/>
+                <w:bCs/>
+              </w:rPr>
+              <w:t>PAT-062</w:t>
+            </w:r>
+          </w:p>
+        </w:tc>
+        <w:tc>
+          <w:tcPr>
+            <w:tcW w:w="0" w:type="auto"/>
+            <w:tcBorders>
+              <w:top w:val="single" w:sz="6" w:space="0" w:color="C4C7C5"/>
+              <w:left w:val="single" w:sz="6" w:space="0" w:color="C4C7C5"/>
+              <w:bottom w:val="single" w:sz="6" w:space="0" w:color="C4C7C5"/>
+              <w:right w:val="single" w:sz="6" w:space="0" w:color="C4C7C5"/>
+            </w:tcBorders>
+            <w:tcMar>
+              <w:top w:w="120" w:type="dxa"/>
+              <w:left w:w="180" w:type="dxa"/>
+              <w:bottom w:w="120" w:type="dxa"/>
+              <w:right w:w="180" w:type="dxa"/>
+            </w:tcMar>
+            <w:vAlign w:val="center"/>
+            <w:hideMark/>
+          </w:tcPr>
+          <w:p>
+            <w:r>
+              <w:t>Learning Progress Awareness</w:t>
+            </w:r>
+          </w:p>
+        </w:tc>
+        <w:tc>
+          <w:tcPr>
+            <w:tcW w:w="0" w:type="auto"/>
+            <w:tcBorders>
+              <w:top w:val="single" w:sz="6" w:space="0" w:color="C4C7C5"/>
+              <w:left w:val="single" w:sz="6" w:space="0" w:color="C4C7C5"/>
+              <w:bottom w:val="single" w:sz="6" w:space="0" w:color="C4C7C5"/>
+              <w:right w:val="single" w:sz="6" w:space="0" w:color="C4C7C5"/>
+            </w:tcBorders>
+            <w:tcMar>
+              <w:top w:w="120" w:type="dxa"/>
+              <w:left w:w="180" w:type="dxa"/>
+              <w:bottom w:w="120" w:type="dxa"/>
+              <w:right w:w="180" w:type="dxa"/>
+            </w:tcMar>
+            <w:vAlign w:val="center"/>
+            <w:hideMark/>
+          </w:tcPr>
+          <w:p>
+            <w:r>
+              <w:t>Volume 01 – Cognitive Behaviour</w:t>
+            </w:r>
+          </w:p>
+        </w:tc>
+      </w:tr>
+      <w:tr>
+        <w:trPr>
+          <w:tblCellSpacing w:w="15" w:type="dxa"/>
+        </w:trPr>
+        <w:tc>
+          <w:tcPr>
+            <w:tcW w:w="0" w:type="auto"/>
+            <w:tcBorders>
+              <w:top w:val="single" w:sz="6" w:space="0" w:color="C4C7C5"/>
+              <w:left w:val="single" w:sz="6" w:space="0" w:color="C4C7C5"/>
+              <w:bottom w:val="single" w:sz="6" w:space="0" w:color="C4C7C5"/>
+              <w:right w:val="single" w:sz="6" w:space="0" w:color="C4C7C5"/>
+            </w:tcBorders>
+            <w:tcMar>
+              <w:top w:w="120" w:type="dxa"/>
+              <w:left w:w="180" w:type="dxa"/>
+              <w:bottom w:w="120" w:type="dxa"/>
+              <w:right w:w="180" w:type="dxa"/>
+            </w:tcMar>
+            <w:vAlign w:val="center"/>
+            <w:hideMark/>
+          </w:tcPr>
+          <w:p>
+            <w:r>
+              <w:rPr>
+                <w:b/>
+                <w:bCs/>
+              </w:rPr>
+              <w:lastRenderedPageBreak/>
+              <w:t>PAT-063</w:t>
+            </w:r>
+          </w:p>
+        </w:tc>
+        <w:tc>
+          <w:tcPr>
+            <w:tcW w:w="0" w:type="auto"/>
+            <w:tcBorders>
+              <w:top w:val="single" w:sz="6" w:space="0" w:color="C4C7C5"/>
+              <w:left w:val="single" w:sz="6" w:space="0" w:color="C4C7C5"/>
+              <w:bottom w:val="single" w:sz="6" w:space="0" w:color="C4C7C5"/>
+              <w:right w:val="single" w:sz="6" w:space="0" w:color="C4C7C5"/>
+            </w:tcBorders>
+            <w:tcMar>
+              <w:top w:w="120" w:type="dxa"/>
+              <w:left w:w="180" w:type="dxa"/>
+              <w:bottom w:w="120" w:type="dxa"/>
+              <w:right w:w="180" w:type="dxa"/>
+            </w:tcMar>
+            <w:vAlign w:val="center"/>
+            <w:hideMark/>
+          </w:tcPr>
+          <w:p>
+            <w:r>
+              <w:t>Learning Strategy Evolution</w:t>
+            </w:r>
+          </w:p>
+        </w:tc>
+        <w:tc>
+          <w:tcPr>
+            <w:tcW w:w="0" w:type="auto"/>
+            <w:tcBorders>
+              <w:top w:val="single" w:sz="6" w:space="0" w:color="C4C7C5"/>
+              <w:left w:val="single" w:sz="6" w:space="0" w:color="C4C7C5"/>
+              <w:bottom w:val="single" w:sz="6" w:space="0" w:color="C4C7C5"/>
+              <w:right w:val="single" w:sz="6" w:space="0" w:color="C4C7C5"/>
+            </w:tcBorders>
+            <w:tcMar>
+              <w:top w:w="120" w:type="dxa"/>
+              <w:left w:w="180" w:type="dxa"/>
+              <w:bottom w:w="120" w:type="dxa"/>
+              <w:right w:w="180" w:type="dxa"/>
+            </w:tcMar>
+            <w:vAlign w:val="center"/>
+            <w:hideMark/>
+          </w:tcPr>
+          <w:p>
+            <w:r>
+              <w:t>Volume 01 – Cognitive Behaviour</w:t>
+            </w:r>
+          </w:p>
+        </w:tc>
+      </w:tr>
+      <w:tr>
+        <w:trPr>
+          <w:tblCellSpacing w:w="15" w:type="dxa"/>
+        </w:trPr>
+        <w:tc>
+          <w:tcPr>
+            <w:tcW w:w="0" w:type="auto"/>
+            <w:tcBorders>
+              <w:top w:val="single" w:sz="6" w:space="0" w:color="C4C7C5"/>
+              <w:left w:val="single" w:sz="6" w:space="0" w:color="C4C7C5"/>
+              <w:bottom w:val="single" w:sz="6" w:space="0" w:color="C4C7C5"/>
+              <w:right w:val="single" w:sz="6" w:space="0" w:color="C4C7C5"/>
+            </w:tcBorders>
+            <w:tcMar>
+              <w:top w:w="120" w:type="dxa"/>
+              <w:left w:w="180" w:type="dxa"/>
+              <w:bottom w:w="120" w:type="dxa"/>
+              <w:right w:w="180" w:type="dxa"/>
+            </w:tcMar>
+            <w:vAlign w:val="center"/>
+            <w:hideMark/>
+          </w:tcPr>
+          <w:p>
+            <w:r>
+              <w:rPr>
+                <w:b/>
+                <w:bCs/>
+              </w:rPr>
+              <w:t>PAT-064</w:t>
+            </w:r>
+          </w:p>
+        </w:tc>
+        <w:tc>
+          <w:tcPr>
+            <w:tcW w:w="0" w:type="auto"/>
+            <w:tcBorders>
+              <w:top w:val="single" w:sz="6" w:space="0" w:color="C4C7C5"/>
+              <w:left w:val="single" w:sz="6" w:space="0" w:color="C4C7C5"/>
+              <w:bottom w:val="single" w:sz="6" w:space="0" w:color="C4C7C5"/>
+              <w:right w:val="single" w:sz="6" w:space="0" w:color="C4C7C5"/>
+            </w:tcBorders>
+            <w:tcMar>
+              <w:top w:w="120" w:type="dxa"/>
+              <w:left w:w="180" w:type="dxa"/>
+              <w:bottom w:w="120" w:type="dxa"/>
+              <w:right w:w="180" w:type="dxa"/>
+            </w:tcMar>
+            <w:vAlign w:val="center"/>
+            <w:hideMark/>
+          </w:tcPr>
+          <w:p>
+            <w:r>
+              <w:t>Knowledge Integration</w:t>
+            </w:r>
+          </w:p>
+        </w:tc>
+        <w:tc>
+          <w:tcPr>
+            <w:tcW w:w="0" w:type="auto"/>
+            <w:tcBorders>
+              <w:top w:val="single" w:sz="6" w:space="0" w:color="C4C7C5"/>
+              <w:left w:val="single" w:sz="6" w:space="0" w:color="C4C7C5"/>
+              <w:bottom w:val="single" w:sz="6" w:space="0" w:color="C4C7C5"/>
+              <w:right w:val="single" w:sz="6" w:space="0" w:color="C4C7C5"/>
+            </w:tcBorders>
+            <w:tcMar>
+              <w:top w:w="120" w:type="dxa"/>
+              <w:left w:w="180" w:type="dxa"/>
+              <w:bottom w:w="120" w:type="dxa"/>
+              <w:right w:w="180" w:type="dxa"/>
+            </w:tcMar>
+            <w:vAlign w:val="center"/>
+            <w:hideMark/>
+          </w:tcPr>
+          <w:p>
+            <w:r>
+              <w:t>Volume 02 – Knowledge &amp; Information Behaviour</w:t>
             </w:r>
           </w:p>
         </w:tc>
@@ -4968,6 +5751,14 @@
         <w:rPr>
           <w:b/>
           <w:bCs/>
+        </w:rPr>
+      </w:pPr>
+    </w:p>
+    <w:p>
+      <w:pPr>
+        <w:rPr>
+          <w:i/>
+          <w:iCs/>
         </w:rPr>
       </w:pPr>
       <w:r>
@@ -5109,10 +5900,6 @@
           </w:tcPr>
           <w:p>
             <w:r>
-              <w:rPr>
-                <w:b/>
-                <w:bCs/>
-              </w:rPr>
               <w:t>Volume 01</w:t>
             </w:r>
           </w:p>
@@ -5161,7 +5948,7 @@
           </w:tcPr>
           <w:p>
             <w:r>
-              <w:t>12</w:t>
+              <w:t>14</w:t>
             </w:r>
           </w:p>
         </w:tc>
@@ -5190,10 +5977,6 @@
           </w:tcPr>
           <w:p>
             <w:r>
-              <w:rPr>
-                <w:b/>
-                <w:bCs/>
-              </w:rPr>
               <w:t>Volume 02</w:t>
             </w:r>
           </w:p>
@@ -5242,7 +6025,7 @@
           </w:tcPr>
           <w:p>
             <w:r>
-              <w:t>9</w:t>
+              <w:t>12</w:t>
             </w:r>
           </w:p>
         </w:tc>
@@ -5271,10 +6054,6 @@
           </w:tcPr>
           <w:p>
             <w:r>
-              <w:rPr>
-                <w:b/>
-                <w:bCs/>
-              </w:rPr>
               <w:t>Volume 03</w:t>
             </w:r>
           </w:p>
@@ -5352,10 +6131,6 @@
           </w:tcPr>
           <w:p>
             <w:r>
-              <w:rPr>
-                <w:b/>
-                <w:bCs/>
-              </w:rPr>
               <w:t>Volume 04</w:t>
             </w:r>
           </w:p>
@@ -5404,7 +6179,7 @@
           </w:tcPr>
           <w:p>
             <w:r>
-              <w:t>9</w:t>
+              <w:t>11</w:t>
             </w:r>
           </w:p>
         </w:tc>
@@ -5433,11 +6208,6 @@
           </w:tcPr>
           <w:p>
             <w:r>
-              <w:rPr>
-                <w:b/>
-                <w:bCs/>
-              </w:rPr>
-              <w:lastRenderedPageBreak/>
               <w:t>Volume 05</w:t>
             </w:r>
           </w:p>
@@ -5567,14 +6337,7 @@
                 <w:b/>
                 <w:bCs/>
               </w:rPr>
-              <w:t>5</w:t>
-            </w:r>
-            <w:r>
-              <w:rPr>
-                <w:b/>
-                <w:bCs/>
-              </w:rPr>
-              <w:t>8</w:t>
+              <w:t>64</w:t>
             </w:r>
           </w:p>
         </w:tc>

</xml_diff>